<commit_message>
Replace Geist default font with Plus Jakarta Sans and Outfit supporting Vietnamese subsets to fix accents rendering
</commit_message>
<xml_diff>
--- a/ĐỀ ÁN BÁO CÁO CỔ ĐÔNG - DỰ ÁN NỘI THẤT CHIẾN LƯỢC VINHOMES HẬU NGHĨA.docx
+++ b/ĐỀ ÁN BÁO CÁO CỔ ĐÔNG - DỰ ÁN NỘI THẤT CHIẾN LƯỢC VINHOMES HẬU NGHĨA.docx
@@ -108,7 +108,7 @@
     </w:p>
     <w:p>
       <w:pPr>
-        <w:spacing w:after="1200"/>
+        <w:spacing w:after="120"/>
         <w:jc w:val="center"/>
       </w:pPr>
       <w:r>
@@ -119,7 +119,23 @@
           <w:sz w:val="20"/>
           <w:szCs w:val="20"/>
         </w:rPr>
-        <w:t xml:space="preserve">Xin phê duyệt chủ trương đầu tư, ngân sách và lộ trình triển khai</w:t>
+        <w:t xml:space="preserve">Xin phê duyệt phạm vi hạng mục đầu tư và lộ trình triển khai</w:t>
+      </w:r>
+    </w:p>
+    <w:p>
+      <w:pPr>
+        <w:spacing w:after="1200"/>
+        <w:jc w:val="center"/>
+      </w:pPr>
+      <w:r>
+        <w:rPr>
+          <w:i/>
+          <w:iCs/>
+          <w:color w:val="B8860B"/>
+          <w:sz w:val="18"/>
+          <w:szCs w:val="18"/>
+        </w:rPr>
+        <w:t xml:space="preserve">(Bản phê duyệt phạm vi — phần chi phí chi tiết sẽ trình bổ sung ở phụ lục riêng sau khi phạm vi được thông qua)</w:t>
       </w:r>
     </w:p>
     <w:p>
@@ -310,7 +326,7 @@
           <w:sz w:val="22"/>
           <w:szCs w:val="22"/>
         </w:rPr>
-        <w:t xml:space="preserve">9. Ngân sách &amp; định biên nhân sự</w:t>
+        <w:t xml:space="preserve">9. Hạng mục đầu tư &amp; nhân sự đề xuất phê duyệt</w:t>
       </w:r>
     </w:p>
     <w:p>
@@ -519,7 +535,7 @@
                 <w:sz w:val="26"/>
                 <w:szCs w:val="26"/>
               </w:rPr>
-              <w:t xml:space="preserve">200 triệu VNĐ</w:t>
+              <w:t xml:space="preserve">3 nhóm: Nhân sự – Hạ tầng – Công nghệ</w:t>
             </w:r>
           </w:p>
           <w:p>
@@ -532,7 +548,7 @@
                 <w:sz w:val="18"/>
                 <w:szCs w:val="18"/>
               </w:rPr>
-              <w:t xml:space="preserve">Ngân sách nhân sự tech</w:t>
+              <w:t xml:space="preserve">Số nhóm hạng mục cần duyệt</w:t>
             </w:r>
           </w:p>
         </w:tc>
@@ -627,6 +643,28 @@
     </w:p>
     <w:p>
       <w:pPr>
+        <w:pBdr>
+          <w:left w:val="single" w:color="B8860B" w:sz="18" w:space="8"/>
+        </w:pBdr>
+        <w:shd w:fill="F2F2F2" w:val="clear"/>
+        <w:spacing w:after="200" w:before="120" w:line="300"/>
+        <w:ind w:left="200"/>
+      </w:pPr>
+      <w:r>
+        <w:rPr>
+          <w:b/>
+          <w:bCs/>
+          <w:i/>
+          <w:iCs/>
+          <w:color w:val="1F3864"/>
+          <w:sz w:val="20"/>
+          <w:szCs w:val="20"/>
+        </w:rPr>
+        <w:t xml:space="preserve">Lưu ý phạm vi đề án: Đây là bản trình duyệt PHẠM VI (scope) — toàn bộ hạng mục nhân sự, hạ tầng và công nghệ cần triển khai được liệt kê đầy đủ để HĐQT/Cổ đông xem xét TRƯỚC. Phần chi phí, đơn giá và tổng ngân sách chi tiết cho từng hạng mục sẽ được trình thành Phụ lục Ngân sách riêng ngay sau khi phạm vi này được thông qua.</w:t>
+      </w:r>
+    </w:p>
+    <w:p>
+      <w:pPr>
         <w:spacing w:after="160" w:line="300"/>
         <w:jc w:val="both"/>
       </w:pPr>
@@ -639,7 +677,7 @@
           <w:sz w:val="22"/>
           <w:szCs w:val="22"/>
         </w:rPr>
-        <w:t xml:space="preserve">Đề án đề xuất HĐQT/cổ đông phê duyệt 3 nội dung: (1) chủ trương đầu tư ngân sách công nghệ theo phương án tối ưu chi phí (MVP + tích hợp nền tảng có sẵn), (2) mốc giải ngân gắn với nghiệm thu kỹ thuật theo 4 đợt để bảo vệ dòng vốn, và (3) kế hoạch nhân rộng mô hình sang các cụm dự án Vinhomes tiếp theo sau khi Beta Test tại Hậu Nghĩa thành công.</w:t>
+        <w:t xml:space="preserve">Đề án đề xuất HĐQT/cổ đông phê duyệt 3 nội dung: (1) toàn bộ phạm vi hạng mục đầu tư — nhân sự, hạ tầng công nghệ và công cụ vận hành — theo phương án MVP kết hợp tích hợp nền tảng có sẵn, (2) cơ chế nghiệm thu kỹ thuật theo 4 giai đoạn để kiểm soát chất lượng và tiến độ đội Tech, và (3) kế hoạch nhân rộng mô hình sang các cụm dự án Vinhomes tiếp theo sau khi Beta Test tại Hậu Nghĩa thành công. Ngân sách chi tiết sẽ được trình duyệt ở vòng tiếp theo, sau khi phạm vi này được HĐQT/Cổ đông thông qua.</w:t>
       </w:r>
     </w:p>
     <w:p>
@@ -3940,7 +3978,7 @@
           <w:sz w:val="24"/>
           <w:szCs w:val="24"/>
         </w:rPr>
-        <w:t xml:space="preserve">8.1. Mốc giải ngân cho đội Tech (bảo vệ dòng vốn)</w:t>
+        <w:t xml:space="preserve">8.1. Cơ chế nghiệm thu kỹ thuật theo 4 giai đoạn (kiểm soát chất lượng đội Tech)</w:t>
       </w:r>
     </w:p>
     <w:p>
@@ -3957,7 +3995,7 @@
           <w:sz w:val="22"/>
           <w:szCs w:val="22"/>
         </w:rPr>
-        <w:t xml:space="preserve">200 triệu VNĐ ngân sách nhân sự tech được chia làm 4 đợt giải ngân gắn chặt với 4 mốc nghiệm thu kỹ thuật thực tế, tránh rủi ro đội outsource trễ hạn hoặc bàn giao code kém chất lượng:</w:t>
+        <w:t xml:space="preserve">Để tránh rủi ro đội Tech (nội bộ hoặc outsource) trễ tiến độ hoặc bàn giao chất lượng kém, tiến độ kỹ thuật được chốt thành 4 cổng nghiệm thu (gate) độc lập, mỗi cổng có tiêu chí đạt/không đạt rõ ràng. Cơ chế thanh toán/giải ngân gắn với từng cổng sẽ được quy định cụ thể trong Phụ lục Ngân sách trình sau.</w:t>
       </w:r>
     </w:p>
     <w:tbl>
@@ -3974,8 +4012,8 @@
       </w:tblPr>
       <w:tblGrid>
         <w:gridCol w:w="1400"/>
-        <w:gridCol w:w="1200"/>
-        <w:gridCol w:w="6750"/>
+        <w:gridCol w:w="1900"/>
+        <w:gridCol w:w="6050"/>
       </w:tblGrid>
       <w:tr>
         <w:trPr>
@@ -4002,13 +4040,13 @@
                 <w:sz w:val="20"/>
                 <w:szCs w:val="20"/>
               </w:rPr>
-              <w:t xml:space="preserve">Đợt</w:t>
-            </w:r>
-          </w:p>
-        </w:tc>
-        <w:tc>
-          <w:tcPr>
-            <w:tcW w:type="dxa" w:w="1200"/>
+              <w:t xml:space="preserve">Cổng nghiệm thu</w:t>
+            </w:r>
+          </w:p>
+        </w:tc>
+        <w:tc>
+          <w:tcPr>
+            <w:tcW w:type="dxa" w:w="1900"/>
             <w:shd w:fill="1F3864" w:val="clear"/>
             <w:tcMar>
               <w:top w:type="dxa" w:w="80"/>
@@ -4027,13 +4065,13 @@
                 <w:sz w:val="20"/>
                 <w:szCs w:val="20"/>
               </w:rPr>
-              <w:t xml:space="preserve">Tỷ lệ</w:t>
-            </w:r>
-          </w:p>
-        </w:tc>
-        <w:tc>
-          <w:tcPr>
-            <w:tcW w:type="dxa" w:w="6750"/>
+              <w:t xml:space="preserve">Thời điểm</w:t>
+            </w:r>
+          </w:p>
+        </w:tc>
+        <w:tc>
+          <w:tcPr>
+            <w:tcW w:type="dxa" w:w="6050"/>
             <w:shd w:fill="1F3864" w:val="clear"/>
             <w:tcMar>
               <w:top w:type="dxa" w:w="80"/>
@@ -4052,7 +4090,7 @@
                 <w:sz w:val="20"/>
                 <w:szCs w:val="20"/>
               </w:rPr>
-              <w:t xml:space="preserve">Điều kiện nghiệm thu</w:t>
+              <w:t xml:space="preserve">Điều kiện nghiệm thu (Đạt/Không đạt)</w:t>
             </w:r>
           </w:p>
         </w:tc>
@@ -4078,55 +4116,55 @@
                 <w:sz w:val="20"/>
                 <w:szCs w:val="20"/>
               </w:rPr>
-              <w:t xml:space="preserve">Đợt 1</w:t>
-            </w:r>
-          </w:p>
-        </w:tc>
-        <w:tc>
-          <w:tcPr>
-            <w:tcW w:type="dxa" w:w="1200"/>
-            <w:tcMar>
-              <w:top w:type="dxa" w:w="80"/>
-              <w:left w:type="dxa" w:w="100"/>
-              <w:bottom w:type="dxa" w:w="80"/>
-              <w:right w:type="dxa" w:w="100"/>
-            </w:tcMar>
-            <w:vAlign w:val="center"/>
-          </w:tcPr>
-          <w:p>
-            <w:r>
-              <w:rPr>
-                <w:b w:val="false"/>
-                <w:bCs w:val="false"/>
-                <w:color w:val="000000"/>
-                <w:sz w:val="20"/>
-                <w:szCs w:val="20"/>
-              </w:rPr>
-              <w:t xml:space="preserve">20%</w:t>
-            </w:r>
-          </w:p>
-        </w:tc>
-        <w:tc>
-          <w:tcPr>
-            <w:tcW w:type="dxa" w:w="6750"/>
-            <w:tcMar>
-              <w:top w:type="dxa" w:w="80"/>
-              <w:left w:type="dxa" w:w="100"/>
-              <w:bottom w:type="dxa" w:w="80"/>
-              <w:right w:type="dxa" w:w="100"/>
-            </w:tcMar>
-            <w:vAlign w:val="center"/>
-          </w:tcPr>
-          <w:p>
-            <w:r>
-              <w:rPr>
-                <w:b w:val="false"/>
-                <w:bCs w:val="false"/>
-                <w:color w:val="000000"/>
-                <w:sz w:val="20"/>
-                <w:szCs w:val="20"/>
-              </w:rPr>
-              <w:t xml:space="preserve">Ký hợp đồng &amp; thiết lập hạ tầng: Database hoàn thiện trên Supabase, UI/UX Figma đầy đủ, Repository GitHub bàn giao</w:t>
+              <w:t xml:space="preserve">Cổng 1</w:t>
+            </w:r>
+          </w:p>
+        </w:tc>
+        <w:tc>
+          <w:tcPr>
+            <w:tcW w:type="dxa" w:w="1900"/>
+            <w:tcMar>
+              <w:top w:type="dxa" w:w="80"/>
+              <w:left w:type="dxa" w:w="100"/>
+              <w:bottom w:type="dxa" w:w="80"/>
+              <w:right w:type="dxa" w:w="100"/>
+            </w:tcMar>
+            <w:vAlign w:val="center"/>
+          </w:tcPr>
+          <w:p>
+            <w:r>
+              <w:rPr>
+                <w:b w:val="false"/>
+                <w:bCs w:val="false"/>
+                <w:color w:val="000000"/>
+                <w:sz w:val="20"/>
+                <w:szCs w:val="20"/>
+              </w:rPr>
+              <w:t xml:space="preserve">Ký hợp đồng &amp; thiết lập hạ tầng</w:t>
+            </w:r>
+          </w:p>
+        </w:tc>
+        <w:tc>
+          <w:tcPr>
+            <w:tcW w:type="dxa" w:w="6050"/>
+            <w:tcMar>
+              <w:top w:type="dxa" w:w="80"/>
+              <w:left w:type="dxa" w:w="100"/>
+              <w:bottom w:type="dxa" w:w="80"/>
+              <w:right w:type="dxa" w:w="100"/>
+            </w:tcMar>
+            <w:vAlign w:val="center"/>
+          </w:tcPr>
+          <w:p>
+            <w:r>
+              <w:rPr>
+                <w:b w:val="false"/>
+                <w:bCs w:val="false"/>
+                <w:color w:val="000000"/>
+                <w:sz w:val="20"/>
+                <w:szCs w:val="20"/>
+              </w:rPr>
+              <w:t xml:space="preserve">Database hoàn thiện trên Supabase, UI/UX Figma đầy đủ, Repository GitHub bàn giao</w:t>
             </w:r>
           </w:p>
         </w:tc>
@@ -4153,13 +4191,13 @@
                 <w:sz w:val="20"/>
                 <w:szCs w:val="20"/>
               </w:rPr>
-              <w:t xml:space="preserve">Đợt 2</w:t>
-            </w:r>
-          </w:p>
-        </w:tc>
-        <w:tc>
-          <w:tcPr>
-            <w:tcW w:type="dxa" w:w="1200"/>
+              <w:t xml:space="preserve">Cổng 2</w:t>
+            </w:r>
+          </w:p>
+        </w:tc>
+        <w:tc>
+          <w:tcPr>
+            <w:tcW w:type="dxa" w:w="1900"/>
             <w:shd w:fill="F2F2F2" w:val="clear"/>
             <w:tcMar>
               <w:top w:type="dxa" w:w="80"/>
@@ -4178,13 +4216,13 @@
                 <w:sz w:val="20"/>
                 <w:szCs w:val="20"/>
               </w:rPr>
-              <w:t xml:space="preserve">30%</w:t>
-            </w:r>
-          </w:p>
-        </w:tc>
-        <w:tc>
-          <w:tcPr>
-            <w:tcW w:type="dxa" w:w="6750"/>
+              <w:t xml:space="preserve">Nghiệm thu tuần 3</w:t>
+            </w:r>
+          </w:p>
+        </w:tc>
+        <w:tc>
+          <w:tcPr>
+            <w:tcW w:type="dxa" w:w="6050"/>
             <w:shd w:fill="F2F2F2" w:val="clear"/>
             <w:tcMar>
               <w:top w:type="dxa" w:w="80"/>
@@ -4203,7 +4241,7 @@
                 <w:sz w:val="20"/>
                 <w:szCs w:val="20"/>
               </w:rPr>
-              <w:t xml:space="preserve">Nghiệm thu tuần 3: Web E-commerce, giỏ hàng thông minh (trừ 6% Vin), ma trận phân quyền 5 vị trí — demo chạy mượt đăng nhập &amp; lên đơn</w:t>
+              <w:t xml:space="preserve">Web E-commerce, giỏ hàng thông minh (trừ 6% Vin), ma trận phân quyền 5 vị trí — demo chạy mượt đăng nhập &amp; lên đơn</w:t>
             </w:r>
           </w:p>
         </w:tc>
@@ -4229,55 +4267,55 @@
                 <w:sz w:val="20"/>
                 <w:szCs w:val="20"/>
               </w:rPr>
-              <w:t xml:space="preserve">Đợt 3</w:t>
-            </w:r>
-          </w:p>
-        </w:tc>
-        <w:tc>
-          <w:tcPr>
-            <w:tcW w:type="dxa" w:w="1200"/>
-            <w:tcMar>
-              <w:top w:type="dxa" w:w="80"/>
-              <w:left w:type="dxa" w:w="100"/>
-              <w:bottom w:type="dxa" w:w="80"/>
-              <w:right w:type="dxa" w:w="100"/>
-            </w:tcMar>
-            <w:vAlign w:val="center"/>
-          </w:tcPr>
-          <w:p>
-            <w:r>
-              <w:rPr>
-                <w:b w:val="false"/>
-                <w:bCs w:val="false"/>
-                <w:color w:val="000000"/>
-                <w:sz w:val="20"/>
-                <w:szCs w:val="20"/>
-              </w:rPr>
-              <w:t xml:space="preserve">30%</w:t>
-            </w:r>
-          </w:p>
-        </w:tc>
-        <w:tc>
-          <w:tcPr>
-            <w:tcW w:type="dxa" w:w="6750"/>
-            <w:tcMar>
-              <w:top w:type="dxa" w:w="80"/>
-              <w:left w:type="dxa" w:w="100"/>
-              <w:bottom w:type="dxa" w:w="80"/>
-              <w:right w:type="dxa" w:w="100"/>
-            </w:tcMar>
-            <w:vAlign w:val="center"/>
-          </w:tcPr>
-          <w:p>
-            <w:r>
-              <w:rPr>
-                <w:b w:val="false"/>
-                <w:bCs w:val="false"/>
-                <w:color w:val="000000"/>
-                <w:sz w:val="20"/>
-                <w:szCs w:val="20"/>
-              </w:rPr>
-              <w:t xml:space="preserve">Nghiệm thu tuần 6: Tích hợp API AI (chọn căn Vin Hậu Nghĩa ra ảnh 3D + báo giá SKU thật) và giao diện gọi vật tư QR + chụp ảnh GPS</w:t>
+              <w:t xml:space="preserve">Cổng 3</w:t>
+            </w:r>
+          </w:p>
+        </w:tc>
+        <w:tc>
+          <w:tcPr>
+            <w:tcW w:type="dxa" w:w="1900"/>
+            <w:tcMar>
+              <w:top w:type="dxa" w:w="80"/>
+              <w:left w:type="dxa" w:w="100"/>
+              <w:bottom w:type="dxa" w:w="80"/>
+              <w:right w:type="dxa" w:w="100"/>
+            </w:tcMar>
+            <w:vAlign w:val="center"/>
+          </w:tcPr>
+          <w:p>
+            <w:r>
+              <w:rPr>
+                <w:b w:val="false"/>
+                <w:bCs w:val="false"/>
+                <w:color w:val="000000"/>
+                <w:sz w:val="20"/>
+                <w:szCs w:val="20"/>
+              </w:rPr>
+              <w:t xml:space="preserve">Nghiệm thu tuần 6</w:t>
+            </w:r>
+          </w:p>
+        </w:tc>
+        <w:tc>
+          <w:tcPr>
+            <w:tcW w:type="dxa" w:w="6050"/>
+            <w:tcMar>
+              <w:top w:type="dxa" w:w="80"/>
+              <w:left w:type="dxa" w:w="100"/>
+              <w:bottom w:type="dxa" w:w="80"/>
+              <w:right w:type="dxa" w:w="100"/>
+            </w:tcMar>
+            <w:vAlign w:val="center"/>
+          </w:tcPr>
+          <w:p>
+            <w:r>
+              <w:rPr>
+                <w:b w:val="false"/>
+                <w:bCs w:val="false"/>
+                <w:color w:val="000000"/>
+                <w:sz w:val="20"/>
+                <w:szCs w:val="20"/>
+              </w:rPr>
+              <w:t xml:space="preserve">Tích hợp API AI (chọn căn Vin Hậu Nghĩa ra ảnh 3D + báo giá SKU thật) và giao diện gọi vật tư QR + chụp ảnh GPS</w:t>
             </w:r>
           </w:p>
         </w:tc>
@@ -4304,13 +4342,13 @@
                 <w:sz w:val="20"/>
                 <w:szCs w:val="20"/>
               </w:rPr>
-              <w:t xml:space="preserve">Đợt 4</w:t>
-            </w:r>
-          </w:p>
-        </w:tc>
-        <w:tc>
-          <w:tcPr>
-            <w:tcW w:type="dxa" w:w="1200"/>
+              <w:t xml:space="preserve">Cổng 4</w:t>
+            </w:r>
+          </w:p>
+        </w:tc>
+        <w:tc>
+          <w:tcPr>
+            <w:tcW w:type="dxa" w:w="1900"/>
             <w:shd w:fill="F2F2F2" w:val="clear"/>
             <w:tcMar>
               <w:top w:type="dxa" w:w="80"/>
@@ -4329,13 +4367,13 @@
                 <w:sz w:val="20"/>
                 <w:szCs w:val="20"/>
               </w:rPr>
-              <w:t xml:space="preserve">20%</w:t>
-            </w:r>
-          </w:p>
-        </w:tc>
-        <w:tc>
-          <w:tcPr>
-            <w:tcW w:type="dxa" w:w="6750"/>
+              <w:t xml:space="preserve">Nghiệm thu tuần 8</w:t>
+            </w:r>
+          </w:p>
+        </w:tc>
+        <w:tc>
+          <w:tcPr>
+            <w:tcW w:type="dxa" w:w="6050"/>
             <w:shd w:fill="F2F2F2" w:val="clear"/>
             <w:tcMar>
               <w:top w:type="dxa" w:w="80"/>
@@ -4354,7 +4392,7 @@
                 <w:sz w:val="20"/>
                 <w:szCs w:val="20"/>
               </w:rPr>
-              <w:t xml:space="preserve">Nghiệm thu tuần 8: Beta Test 50 căn hộ mẫu không lỗi nghiêm trọng; bàn giao 100% quyền Master (Supabase, AWS) &amp; mã nguồn sạch trên GitHub</w:t>
+              <w:t xml:space="preserve">Beta Test 50 căn hộ mẫu không lỗi nghiêm trọng; bàn giao 100% quyền Master (Supabase, AWS) &amp; mã nguồn sạch trên GitHub</w:t>
             </w:r>
           </w:p>
         </w:tc>
@@ -4720,7 +4758,24 @@
           <w:sz w:val="30"/>
           <w:szCs w:val="30"/>
         </w:rPr>
-        <w:t xml:space="preserve">9. NGÂN SÁCH &amp; ĐỊNH BIÊN NHÂN SỰ</w:t>
+        <w:t xml:space="preserve">9. HẠNG MỤC ĐẦU TƯ &amp; NHÂN SỰ ĐỀ XUẤT PHÊ DUYỆT</w:t>
+      </w:r>
+    </w:p>
+    <w:p>
+      <w:pPr>
+        <w:spacing w:after="160" w:line="300"/>
+        <w:jc w:val="both"/>
+      </w:pPr>
+      <w:r>
+        <w:rPr>
+          <w:b w:val="false"/>
+          <w:bCs w:val="false"/>
+          <w:i w:val="false"/>
+          <w:iCs w:val="false"/>
+          <w:sz w:val="22"/>
+          <w:szCs w:val="22"/>
+        </w:rPr>
+        <w:t xml:space="preserve">Phần này liệt kê đầy đủ PHẠM VI (scope) các hạng mục cần triển khai — nhân sự, hạ tầng, công cụ và chiến lược thi công — để HĐQT/Cổ đông phê duyệt về mặt chủ trương và khối lượng công việc. Chi phí cụ thể cho từng hạng mục (đơn giá nhân sự, phí bản quyền, phí hạ tầng vận hành...) sẽ được tổng hợp thành Phụ lục Ngân sách riêng, trình duyệt ngay sau khi phạm vi tại mục này được thông qua.</w:t>
       </w:r>
     </w:p>
     <w:p>
@@ -4736,7 +4791,7 @@
           <w:sz w:val="24"/>
           <w:szCs w:val="24"/>
         </w:rPr>
-        <w:t xml:space="preserve">9.1. Phương án tối ưu ngân sách</w:t>
+        <w:t xml:space="preserve">9.1. Nguyên tắc triển khai: tối ưu tốc độ, không tối ưu bằng cách cắt phạm vi</w:t>
       </w:r>
     </w:p>
     <w:p>
@@ -4753,7 +4808,23 @@
           <w:sz w:val="22"/>
           <w:szCs w:val="22"/>
         </w:rPr>
-        <w:t xml:space="preserve">Với ngân sách 200 triệu VNĐ nhân sự trong 2 tháng, chiến lược phát triển chuyển từ “xây dựng mọi thứ từ đầu” sang “tích hợp nền tảng có sẵn (low-code/no-code core) + thuê chuyên gia AI viết module lõi” để đảm bảo tính khả thi tài chính.</w:t>
+        <w:t xml:space="preserve">Chiến lược phát triển được thiết kế theo hướng “tích hợp nền tảng có sẵn (low-code/no-code core) + thuê chuyên gia AI viết module lõi” thay vì xây dựng mọi thứ từ đầu — điều này rút ngắn thời gian triển khai mà không cắt giảm bất kỳ hạng mục chức năng nào đã trình bày ở các phần trên (AI Engine, Web E-commerce, Mobile App hiện trường, SRM/PMS, ma trận phân quyền).</w:t>
+      </w:r>
+    </w:p>
+    <w:p>
+      <w:pPr>
+        <w:pStyle w:val="Heading2"/>
+        <w:spacing w:after="160" w:before="320"/>
+      </w:pPr>
+      <w:r>
+        <w:rPr>
+          <w:b/>
+          <w:bCs/>
+          <w:color w:val="1F3864"/>
+          <w:sz w:val="24"/>
+          <w:szCs w:val="24"/>
+        </w:rPr>
+        <w:t xml:space="preserve">9.2. Danh mục hạng mục cần thiết lập (chưa gồm chi phí)</w:t>
       </w:r>
     </w:p>
     <w:tbl>
@@ -4769,9 +4840,9 @@
         </w:tblBorders>
       </w:tblPr>
       <w:tblGrid>
-        <w:gridCol w:w="2700"/>
-        <w:gridCol w:w="2400"/>
-        <w:gridCol w:w="4250"/>
+        <w:gridCol w:w="2500"/>
+        <w:gridCol w:w="5150"/>
+        <w:gridCol w:w="1700"/>
       </w:tblGrid>
       <w:tr>
         <w:trPr>
@@ -4779,7 +4850,7 @@
         </w:trPr>
         <w:tc>
           <w:tcPr>
-            <w:tcW w:type="dxa" w:w="2700"/>
+            <w:tcW w:type="dxa" w:w="2500"/>
             <w:shd w:fill="1F3864" w:val="clear"/>
             <w:tcMar>
               <w:top w:type="dxa" w:w="80"/>
@@ -4798,13 +4869,13 @@
                 <w:sz w:val="20"/>
                 <w:szCs w:val="20"/>
               </w:rPr>
-              <w:t xml:space="preserve">Hạng mục chi phí</w:t>
-            </w:r>
-          </w:p>
-        </w:tc>
-        <w:tc>
-          <w:tcPr>
-            <w:tcW w:type="dxa" w:w="2400"/>
+              <w:t xml:space="preserve">Nhóm hạng mục</w:t>
+            </w:r>
+          </w:p>
+        </w:tc>
+        <w:tc>
+          <w:tcPr>
+            <w:tcW w:type="dxa" w:w="5150"/>
             <w:shd w:fill="1F3864" w:val="clear"/>
             <w:tcMar>
               <w:top w:type="dxa" w:w="80"/>
@@ -4823,13 +4894,13 @@
                 <w:sz w:val="20"/>
                 <w:szCs w:val="20"/>
               </w:rPr>
-              <w:t xml:space="preserve">Định biên ngân sách</w:t>
-            </w:r>
-          </w:p>
-        </w:tc>
-        <w:tc>
-          <w:tcPr>
-            <w:tcW w:type="dxa" w:w="4250"/>
+              <w:t xml:space="preserve">Nội dung cần triển khai</w:t>
+            </w:r>
+          </w:p>
+        </w:tc>
+        <w:tc>
+          <w:tcPr>
+            <w:tcW w:type="dxa" w:w="1700"/>
             <w:shd w:fill="1F3864" w:val="clear"/>
             <w:tcMar>
               <w:top w:type="dxa" w:w="80"/>
@@ -4848,7 +4919,7 @@
                 <w:sz w:val="20"/>
                 <w:szCs w:val="20"/>
               </w:rPr>
-              <w:t xml:space="preserve">Phương án phân bổ</w:t>
+              <w:t xml:space="preserve">Trạng thái</w:t>
             </w:r>
           </w:p>
         </w:tc>
@@ -4856,73 +4927,73 @@
       <w:tr>
         <w:tc>
           <w:tcPr>
-            <w:tcW w:type="dxa" w:w="2700"/>
-            <w:tcMar>
-              <w:top w:type="dxa" w:w="80"/>
-              <w:left w:type="dxa" w:w="100"/>
-              <w:bottom w:type="dxa" w:w="80"/>
-              <w:right w:type="dxa" w:w="100"/>
-            </w:tcMar>
-            <w:vAlign w:val="center"/>
-          </w:tcPr>
-          <w:p>
-            <w:r>
-              <w:rPr>
-                <w:b w:val="false"/>
-                <w:bCs w:val="false"/>
-                <w:color w:val="000000"/>
-                <w:sz w:val="20"/>
-                <w:szCs w:val="20"/>
-              </w:rPr>
-              <w:t xml:space="preserve">Nhân sự dự án (2 tháng)</w:t>
-            </w:r>
-          </w:p>
-        </w:tc>
-        <w:tc>
-          <w:tcPr>
-            <w:tcW w:type="dxa" w:w="2400"/>
-            <w:tcMar>
-              <w:top w:type="dxa" w:w="80"/>
-              <w:left w:type="dxa" w:w="100"/>
-              <w:bottom w:type="dxa" w:w="80"/>
-              <w:right w:type="dxa" w:w="100"/>
-            </w:tcMar>
-            <w:vAlign w:val="center"/>
-          </w:tcPr>
-          <w:p>
-            <w:r>
-              <w:rPr>
-                <w:b w:val="false"/>
-                <w:bCs w:val="false"/>
-                <w:color w:val="000000"/>
-                <w:sz w:val="20"/>
-                <w:szCs w:val="20"/>
-              </w:rPr>
-              <w:t xml:space="preserve">200.000.000 VNĐ</w:t>
-            </w:r>
-          </w:p>
-        </w:tc>
-        <w:tc>
-          <w:tcPr>
-            <w:tcW w:type="dxa" w:w="4250"/>
-            <w:tcMar>
-              <w:top w:type="dxa" w:w="80"/>
-              <w:left w:type="dxa" w:w="100"/>
-              <w:bottom w:type="dxa" w:w="80"/>
-              <w:right w:type="dxa" w:w="100"/>
-            </w:tcMar>
-            <w:vAlign w:val="center"/>
-          </w:tcPr>
-          <w:p>
-            <w:r>
-              <w:rPr>
-                <w:b w:val="false"/>
-                <w:bCs w:val="false"/>
-                <w:color w:val="000000"/>
-                <w:sz w:val="20"/>
-                <w:szCs w:val="20"/>
-              </w:rPr>
-              <w:t xml:space="preserve">1 Tech Lead kiêm Backend (80tr) + 1 Frontend Web/App (60tr) + 1 Kỹ sư AI (60tr) — thuê khoán trọn gói</w:t>
+            <w:tcW w:type="dxa" w:w="2500"/>
+            <w:tcMar>
+              <w:top w:type="dxa" w:w="80"/>
+              <w:left w:type="dxa" w:w="100"/>
+              <w:bottom w:type="dxa" w:w="80"/>
+              <w:right w:type="dxa" w:w="100"/>
+            </w:tcMar>
+            <w:vAlign w:val="center"/>
+          </w:tcPr>
+          <w:p>
+            <w:r>
+              <w:rPr>
+                <w:b w:val="false"/>
+                <w:bCs w:val="false"/>
+                <w:color w:val="000000"/>
+                <w:sz w:val="20"/>
+                <w:szCs w:val="20"/>
+              </w:rPr>
+              <w:t xml:space="preserve">Nhân sự dự án</w:t>
+            </w:r>
+          </w:p>
+        </w:tc>
+        <w:tc>
+          <w:tcPr>
+            <w:tcW w:type="dxa" w:w="5150"/>
+            <w:tcMar>
+              <w:top w:type="dxa" w:w="80"/>
+              <w:left w:type="dxa" w:w="100"/>
+              <w:bottom w:type="dxa" w:w="80"/>
+              <w:right w:type="dxa" w:w="100"/>
+            </w:tcMar>
+            <w:vAlign w:val="center"/>
+          </w:tcPr>
+          <w:p>
+            <w:r>
+              <w:rPr>
+                <w:b w:val="false"/>
+                <w:bCs w:val="false"/>
+                <w:color w:val="000000"/>
+                <w:sz w:val="20"/>
+                <w:szCs w:val="20"/>
+              </w:rPr>
+              <w:t xml:space="preserve">Đội Tech triển khai giai đoạn MVP: Tech Lead kiêm Backend, Frontend Web/App, Kỹ sư AI — thuê khoán trọn gói theo mốc nghiệm thu (xem mục 8.1)</w:t>
+            </w:r>
+          </w:p>
+        </w:tc>
+        <w:tc>
+          <w:tcPr>
+            <w:tcW w:type="dxa" w:w="1700"/>
+            <w:tcMar>
+              <w:top w:type="dxa" w:w="80"/>
+              <w:left w:type="dxa" w:w="100"/>
+              <w:bottom w:type="dxa" w:w="80"/>
+              <w:right w:type="dxa" w:w="100"/>
+            </w:tcMar>
+            <w:vAlign w:val="center"/>
+          </w:tcPr>
+          <w:p>
+            <w:r>
+              <w:rPr>
+                <w:b w:val="false"/>
+                <w:bCs w:val="false"/>
+                <w:color w:val="000000"/>
+                <w:sz w:val="20"/>
+                <w:szCs w:val="20"/>
+              </w:rPr>
+              <w:t xml:space="preserve">Chờ phê duyệt phạm vi</w:t>
             </w:r>
           </w:p>
         </w:tc>
@@ -4930,7 +5001,7 @@
       <w:tr>
         <w:tc>
           <w:tcPr>
-            <w:tcW w:type="dxa" w:w="2700"/>
+            <w:tcW w:type="dxa" w:w="2500"/>
             <w:shd w:fill="F2F2F2" w:val="clear"/>
             <w:tcMar>
               <w:top w:type="dxa" w:w="80"/>
@@ -4949,13 +5020,13 @@
                 <w:sz w:val="20"/>
                 <w:szCs w:val="20"/>
               </w:rPr>
-              <w:t xml:space="preserve">Hạ tầng setup ban đầu</w:t>
-            </w:r>
-          </w:p>
-        </w:tc>
-        <w:tc>
-          <w:tcPr>
-            <w:tcW w:type="dxa" w:w="2400"/>
+              <w:t xml:space="preserve">Nền tảng thương mại điện tử</w:t>
+            </w:r>
+          </w:p>
+        </w:tc>
+        <w:tc>
+          <w:tcPr>
+            <w:tcW w:type="dxa" w:w="5150"/>
             <w:shd w:fill="F2F2F2" w:val="clear"/>
             <w:tcMar>
               <w:top w:type="dxa" w:w="80"/>
@@ -4974,13 +5045,13 @@
                 <w:sz w:val="20"/>
                 <w:szCs w:val="20"/>
               </w:rPr>
-              <w:t xml:space="preserve">100.000.000 VNĐ</w:t>
-            </w:r>
-          </w:p>
-        </w:tc>
-        <w:tc>
-          <w:tcPr>
-            <w:tcW w:type="dxa" w:w="4250"/>
+              <w:t xml:space="preserve">Bản quyền/license core E-commerce có sẵn (dạng Strapi/WooCommerce + Next.js), template UI/UX, thiết lập hệ thống tổng thể</w:t>
+            </w:r>
+          </w:p>
+        </w:tc>
+        <w:tc>
+          <w:tcPr>
+            <w:tcW w:type="dxa" w:w="1700"/>
             <w:shd w:fill="F2F2F2" w:val="clear"/>
             <w:tcMar>
               <w:top w:type="dxa" w:w="80"/>
@@ -4999,7 +5070,7 @@
                 <w:sz w:val="20"/>
                 <w:szCs w:val="20"/>
               </w:rPr>
-              <w:t xml:space="preserve">Bản quyền core thương mại điện tử có sẵn, template UI/UX, thiết lập hệ thống tổng thể</w:t>
+              <w:t xml:space="preserve">Chờ phê duyệt phạm vi</w:t>
             </w:r>
           </w:p>
         </w:tc>
@@ -5007,73 +5078,73 @@
       <w:tr>
         <w:tc>
           <w:tcPr>
-            <w:tcW w:type="dxa" w:w="2700"/>
-            <w:tcMar>
-              <w:top w:type="dxa" w:w="80"/>
-              <w:left w:type="dxa" w:w="100"/>
-              <w:bottom w:type="dxa" w:w="80"/>
-              <w:right w:type="dxa" w:w="100"/>
-            </w:tcMar>
-            <w:vAlign w:val="center"/>
-          </w:tcPr>
-          <w:p>
-            <w:r>
-              <w:rPr>
-                <w:b w:val="false"/>
-                <w:bCs w:val="false"/>
-                <w:color w:val="000000"/>
-                <w:sz w:val="20"/>
-                <w:szCs w:val="20"/>
-              </w:rPr>
-              <w:t xml:space="preserve">Phí duy trì Supabase</w:t>
-            </w:r>
-          </w:p>
-        </w:tc>
-        <w:tc>
-          <w:tcPr>
-            <w:tcW w:type="dxa" w:w="2400"/>
-            <w:tcMar>
-              <w:top w:type="dxa" w:w="80"/>
-              <w:left w:type="dxa" w:w="100"/>
-              <w:bottom w:type="dxa" w:w="80"/>
-              <w:right w:type="dxa" w:w="100"/>
-            </w:tcMar>
-            <w:vAlign w:val="center"/>
-          </w:tcPr>
-          <w:p>
-            <w:r>
-              <w:rPr>
-                <w:b w:val="false"/>
-                <w:bCs w:val="false"/>
-                <w:color w:val="000000"/>
-                <w:sz w:val="20"/>
-                <w:szCs w:val="20"/>
-              </w:rPr>
-              <w:t xml:space="preserve">~2.500.000 VNĐ/tháng (100 USD)</w:t>
-            </w:r>
-          </w:p>
-        </w:tc>
-        <w:tc>
-          <w:tcPr>
-            <w:tcW w:type="dxa" w:w="4250"/>
-            <w:tcMar>
-              <w:top w:type="dxa" w:w="80"/>
-              <w:left w:type="dxa" w:w="100"/>
-              <w:bottom w:type="dxa" w:w="80"/>
-              <w:right w:type="dxa" w:w="100"/>
-            </w:tcMar>
-            <w:vAlign w:val="center"/>
-          </w:tcPr>
-          <w:p>
-            <w:r>
-              <w:rPr>
-                <w:b w:val="false"/>
-                <w:bCs w:val="false"/>
-                <w:color w:val="000000"/>
-                <w:sz w:val="20"/>
-                <w:szCs w:val="20"/>
-              </w:rPr>
-              <w:t xml:space="preserve">Gói Supabase Pro: backup tự động, mã hóa dữ liệu khách hàng, tốc độ truy vấn cao</w:t>
+            <w:tcW w:type="dxa" w:w="2500"/>
+            <w:tcMar>
+              <w:top w:type="dxa" w:w="80"/>
+              <w:left w:type="dxa" w:w="100"/>
+              <w:bottom w:type="dxa" w:w="80"/>
+              <w:right w:type="dxa" w:w="100"/>
+            </w:tcMar>
+            <w:vAlign w:val="center"/>
+          </w:tcPr>
+          <w:p>
+            <w:r>
+              <w:rPr>
+                <w:b w:val="false"/>
+                <w:bCs w:val="false"/>
+                <w:color w:val="000000"/>
+                <w:sz w:val="20"/>
+                <w:szCs w:val="20"/>
+              </w:rPr>
+              <w:t xml:space="preserve">Hạ tầng Database &amp; Auth</w:t>
+            </w:r>
+          </w:p>
+        </w:tc>
+        <w:tc>
+          <w:tcPr>
+            <w:tcW w:type="dxa" w:w="5150"/>
+            <w:tcMar>
+              <w:top w:type="dxa" w:w="80"/>
+              <w:left w:type="dxa" w:w="100"/>
+              <w:bottom w:type="dxa" w:w="80"/>
+              <w:right w:type="dxa" w:w="100"/>
+            </w:tcMar>
+            <w:vAlign w:val="center"/>
+          </w:tcPr>
+          <w:p>
+            <w:r>
+              <w:rPr>
+                <w:b w:val="false"/>
+                <w:bCs w:val="false"/>
+                <w:color w:val="000000"/>
+                <w:sz w:val="20"/>
+                <w:szCs w:val="20"/>
+              </w:rPr>
+              <w:t xml:space="preserve">Đăng ký gói Supabase cấp doanh nghiệp: backup tự động, mã hóa dữ liệu khách hàng, cấu hình Row Level Security, tốc độ truy vấn cao</w:t>
+            </w:r>
+          </w:p>
+        </w:tc>
+        <w:tc>
+          <w:tcPr>
+            <w:tcW w:type="dxa" w:w="1700"/>
+            <w:tcMar>
+              <w:top w:type="dxa" w:w="80"/>
+              <w:left w:type="dxa" w:w="100"/>
+              <w:bottom w:type="dxa" w:w="80"/>
+              <w:right w:type="dxa" w:w="100"/>
+            </w:tcMar>
+            <w:vAlign w:val="center"/>
+          </w:tcPr>
+          <w:p>
+            <w:r>
+              <w:rPr>
+                <w:b w:val="false"/>
+                <w:bCs w:val="false"/>
+                <w:color w:val="000000"/>
+                <w:sz w:val="20"/>
+                <w:szCs w:val="20"/>
+              </w:rPr>
+              <w:t xml:space="preserve">Chờ phê duyệt phạm vi</w:t>
             </w:r>
           </w:p>
         </w:tc>
@@ -5081,7 +5152,7 @@
       <w:tr>
         <w:tc>
           <w:tcPr>
-            <w:tcW w:type="dxa" w:w="2700"/>
+            <w:tcW w:type="dxa" w:w="2500"/>
             <w:shd w:fill="F2F2F2" w:val="clear"/>
             <w:tcMar>
               <w:top w:type="dxa" w:w="80"/>
@@ -5106,7 +5177,7 @@
         </w:tc>
         <w:tc>
           <w:tcPr>
-            <w:tcW w:type="dxa" w:w="2400"/>
+            <w:tcW w:type="dxa" w:w="5150"/>
             <w:shd w:fill="F2F2F2" w:val="clear"/>
             <w:tcMar>
               <w:top w:type="dxa" w:w="80"/>
@@ -5125,13 +5196,13 @@
                 <w:sz w:val="20"/>
                 <w:szCs w:val="20"/>
               </w:rPr>
-              <w:t xml:space="preserve">30.000.000 VNĐ</w:t>
-            </w:r>
-          </w:p>
-        </w:tc>
-        <w:tc>
-          <w:tcPr>
-            <w:tcW w:type="dxa" w:w="4250"/>
+              <w:t xml:space="preserve">Tài khoản API các bên trung gian (Replicate/RunPod/OpenAI) để chạy thuật toán gen ảnh nội thất theo lượt sử dụng</w:t>
+            </w:r>
+          </w:p>
+        </w:tc>
+        <w:tc>
+          <w:tcPr>
+            <w:tcW w:type="dxa" w:w="1700"/>
             <w:shd w:fill="F2F2F2" w:val="clear"/>
             <w:tcMar>
               <w:top w:type="dxa" w:w="80"/>
@@ -5150,7 +5221,7 @@
                 <w:sz w:val="20"/>
                 <w:szCs w:val="20"/>
               </w:rPr>
-              <w:t xml:space="preserve">Nạp API Replicate/RunPod/OpenAI, tính phí theo lượt sử dụng (pay-per-use)</w:t>
+              <w:t xml:space="preserve">Chờ phê duyệt phạm vi</w:t>
             </w:r>
           </w:p>
         </w:tc>
@@ -5158,73 +5229,73 @@
       <w:tr>
         <w:tc>
           <w:tcPr>
-            <w:tcW w:type="dxa" w:w="2700"/>
-            <w:tcMar>
-              <w:top w:type="dxa" w:w="80"/>
-              <w:left w:type="dxa" w:w="100"/>
-              <w:bottom w:type="dxa" w:w="80"/>
-              <w:right w:type="dxa" w:w="100"/>
-            </w:tcMar>
-            <w:vAlign w:val="center"/>
-          </w:tcPr>
-          <w:p>
-            <w:r>
-              <w:rPr>
-                <w:b w:val="false"/>
-                <w:bCs w:val="false"/>
-                <w:color w:val="000000"/>
-                <w:sz w:val="20"/>
-                <w:szCs w:val="20"/>
-              </w:rPr>
-              <w:t xml:space="preserve">Server lưu trữ ảnh/3D</w:t>
-            </w:r>
-          </w:p>
-        </w:tc>
-        <w:tc>
-          <w:tcPr>
-            <w:tcW w:type="dxa" w:w="2400"/>
-            <w:tcMar>
-              <w:top w:type="dxa" w:w="80"/>
-              <w:left w:type="dxa" w:w="100"/>
-              <w:bottom w:type="dxa" w:w="80"/>
-              <w:right w:type="dxa" w:w="100"/>
-            </w:tcMar>
-            <w:vAlign w:val="center"/>
-          </w:tcPr>
-          <w:p>
-            <w:r>
-              <w:rPr>
-                <w:b w:val="false"/>
-                <w:bCs w:val="false"/>
-                <w:color w:val="000000"/>
-                <w:sz w:val="20"/>
-                <w:szCs w:val="20"/>
-              </w:rPr>
-              <w:t xml:space="preserve">20.000.000 VNĐ/năm</w:t>
-            </w:r>
-          </w:p>
-        </w:tc>
-        <w:tc>
-          <w:tcPr>
-            <w:tcW w:type="dxa" w:w="4250"/>
-            <w:tcMar>
-              <w:top w:type="dxa" w:w="80"/>
-              <w:left w:type="dxa" w:w="100"/>
-              <w:bottom w:type="dxa" w:w="80"/>
-              <w:right w:type="dxa" w:w="100"/>
-            </w:tcMar>
-            <w:vAlign w:val="center"/>
-          </w:tcPr>
-          <w:p>
-            <w:r>
-              <w:rPr>
-                <w:b w:val="false"/>
-                <w:bCs w:val="false"/>
-                <w:color w:val="000000"/>
-                <w:sz w:val="20"/>
-                <w:szCs w:val="20"/>
-              </w:rPr>
-              <w:t xml:space="preserve">Gói lưu trữ đám mây tốc độ cao (AWS S3/Google Cloud) cho thư viện vật liệu &amp; ảnh công trường</w:t>
+            <w:tcW w:type="dxa" w:w="2500"/>
+            <w:tcMar>
+              <w:top w:type="dxa" w:w="80"/>
+              <w:left w:type="dxa" w:w="100"/>
+              <w:bottom w:type="dxa" w:w="80"/>
+              <w:right w:type="dxa" w:w="100"/>
+            </w:tcMar>
+            <w:vAlign w:val="center"/>
+          </w:tcPr>
+          <w:p>
+            <w:r>
+              <w:rPr>
+                <w:b w:val="false"/>
+                <w:bCs w:val="false"/>
+                <w:color w:val="000000"/>
+                <w:sz w:val="20"/>
+                <w:szCs w:val="20"/>
+              </w:rPr>
+              <w:t xml:space="preserve">Lưu trữ đám mây</w:t>
+            </w:r>
+          </w:p>
+        </w:tc>
+        <w:tc>
+          <w:tcPr>
+            <w:tcW w:type="dxa" w:w="5150"/>
+            <w:tcMar>
+              <w:top w:type="dxa" w:w="80"/>
+              <w:left w:type="dxa" w:w="100"/>
+              <w:bottom w:type="dxa" w:w="80"/>
+              <w:right w:type="dxa" w:w="100"/>
+            </w:tcMar>
+            <w:vAlign w:val="center"/>
+          </w:tcPr>
+          <w:p>
+            <w:r>
+              <w:rPr>
+                <w:b w:val="false"/>
+                <w:bCs w:val="false"/>
+                <w:color w:val="000000"/>
+                <w:sz w:val="20"/>
+                <w:szCs w:val="20"/>
+              </w:rPr>
+              <w:t xml:space="preserve">Dịch vụ lưu trữ tốc độ cao (AWS S3/Google Cloud Storage) cho thư viện vật liệu 3D và ảnh công trường</w:t>
+            </w:r>
+          </w:p>
+        </w:tc>
+        <w:tc>
+          <w:tcPr>
+            <w:tcW w:type="dxa" w:w="1700"/>
+            <w:tcMar>
+              <w:top w:type="dxa" w:w="80"/>
+              <w:left w:type="dxa" w:w="100"/>
+              <w:bottom w:type="dxa" w:w="80"/>
+              <w:right w:type="dxa" w:w="100"/>
+            </w:tcMar>
+            <w:vAlign w:val="center"/>
+          </w:tcPr>
+          <w:p>
+            <w:r>
+              <w:rPr>
+                <w:b w:val="false"/>
+                <w:bCs w:val="false"/>
+                <w:color w:val="000000"/>
+                <w:sz w:val="20"/>
+                <w:szCs w:val="20"/>
+              </w:rPr>
+              <w:t xml:space="preserve">Chờ phê duyệt phạm vi</w:t>
             </w:r>
           </w:p>
         </w:tc>
@@ -5243,7 +5314,7 @@
           <w:sz w:val="24"/>
           <w:szCs w:val="24"/>
         </w:rPr>
-        <w:t xml:space="preserve">9.2. Chiến lược bung hàng thần tốc trong 2 tháng (nguyên lý MVP)</w:t>
+        <w:t xml:space="preserve">9.3. Chiến lược bung hàng thần tốc trong 2 tháng (nguyên lý MVP)</w:t>
       </w:r>
     </w:p>
     <w:p>
@@ -5277,7 +5348,7 @@
           <w:sz w:val="22"/>
           <w:szCs w:val="22"/>
         </w:rPr>
-        <w:t xml:space="preserve">Tháng 2 — Hoàn thiện mặt sau (đầu vào quản lý SRM &amp; thợ): xây luồng tính BOM tự động từ bảng giá AI; cấu hình ma trận phân quyền Supabase cho 5 vị trí; đóng gói giao diện Web-App tối giản chạy trên trình duyệt điện thoại (không build App Store/Google Play) để tiết kiệm chi phí.</w:t>
+        <w:t xml:space="preserve">Tháng 2 — Hoàn thiện mặt sau (đầu vào quản lý SRM &amp; thợ): xây luồng tính BOM tự động từ bảng giá AI; cấu hình ma trận phân quyền Supabase cho 5 vị trí; đóng gói giao diện Web-App tối giản chạy trên trình duyệt điện thoại (không build App Store/Google Play riêng trong giai đoạn MVP).</w:t>
       </w:r>
     </w:p>
     <w:p>
@@ -5293,7 +5364,24 @@
           <w:sz w:val="24"/>
           <w:szCs w:val="24"/>
         </w:rPr>
-        <w:t xml:space="preserve">9.3. Định biên nhân sự phát triển (giai đoạn mở rộng đầy đủ): 14 nhân sự</w:t>
+        <w:t xml:space="preserve">9.4. Định biên nhân sự phát triển (giai đoạn mở rộng đầy đủ): 14 nhân sự</w:t>
+      </w:r>
+    </w:p>
+    <w:p>
+      <w:pPr>
+        <w:spacing w:after="160" w:line="300"/>
+        <w:jc w:val="both"/>
+      </w:pPr>
+      <w:r>
+        <w:rPr>
+          <w:b w:val="false"/>
+          <w:bCs w:val="false"/>
+          <w:i w:val="false"/>
+          <w:iCs w:val="false"/>
+          <w:sz w:val="22"/>
+          <w:szCs w:val="22"/>
+        </w:rPr>
+        <w:t xml:space="preserve">Ở giai đoạn nhân rộng sang Hóc Môn/Cần Giờ, đội ngũ Tech cần mở rộng đủ 3 nhóm chức năng sau để vận hành song song cả AI, Web, App và hệ thống quản trị công trường:</w:t>
       </w:r>
     </w:p>
     <w:tbl>
@@ -5309,9 +5397,10 @@
         </w:tblBorders>
       </w:tblPr>
       <w:tblGrid>
-        <w:gridCol w:w="2600"/>
-        <w:gridCol w:w="5000"/>
-        <w:gridCol w:w="1750"/>
+        <w:gridCol w:w="2100"/>
+        <w:gridCol w:w="2900"/>
+        <w:gridCol w:w="500"/>
+        <w:gridCol w:w="3850"/>
       </w:tblGrid>
       <w:tr>
         <w:trPr>
@@ -5319,7 +5408,7 @@
         </w:trPr>
         <w:tc>
           <w:tcPr>
-            <w:tcW w:type="dxa" w:w="2600"/>
+            <w:tcW w:type="dxa" w:w="2100"/>
             <w:shd w:fill="1F3864" w:val="clear"/>
             <w:tcMar>
               <w:top w:type="dxa" w:w="80"/>
@@ -5344,7 +5433,7 @@
         </w:tc>
         <w:tc>
           <w:tcPr>
-            <w:tcW w:type="dxa" w:w="5000"/>
+            <w:tcW w:type="dxa" w:w="2900"/>
             <w:shd w:fill="1F3864" w:val="clear"/>
             <w:tcMar>
               <w:top w:type="dxa" w:w="80"/>
@@ -5369,7 +5458,7 @@
         </w:tc>
         <w:tc>
           <w:tcPr>
-            <w:tcW w:type="dxa" w:w="1750"/>
+            <w:tcW w:type="dxa" w:w="500"/>
             <w:shd w:fill="1F3864" w:val="clear"/>
             <w:tcMar>
               <w:top w:type="dxa" w:w="80"/>
@@ -5388,7 +5477,32 @@
                 <w:sz w:val="20"/>
                 <w:szCs w:val="20"/>
               </w:rPr>
-              <w:t xml:space="preserve">Số lượng</w:t>
+              <w:t xml:space="preserve">SL</w:t>
+            </w:r>
+          </w:p>
+        </w:tc>
+        <w:tc>
+          <w:tcPr>
+            <w:tcW w:type="dxa" w:w="3850"/>
+            <w:shd w:fill="1F3864" w:val="clear"/>
+            <w:tcMar>
+              <w:top w:type="dxa" w:w="80"/>
+              <w:left w:type="dxa" w:w="100"/>
+              <w:bottom w:type="dxa" w:w="80"/>
+              <w:right w:type="dxa" w:w="100"/>
+            </w:tcMar>
+            <w:vAlign w:val="center"/>
+          </w:tcPr>
+          <w:p>
+            <w:r>
+              <w:rPr>
+                <w:b/>
+                <w:bCs/>
+                <w:color w:val="FFFFFF"/>
+                <w:sz w:val="20"/>
+                <w:szCs w:val="20"/>
+              </w:rPr>
+              <w:t xml:space="preserve">Nhiệm vụ chính</w:t>
             </w:r>
           </w:p>
         </w:tc>
@@ -5396,7 +5510,7 @@
       <w:tr>
         <w:tc>
           <w:tcPr>
-            <w:tcW w:type="dxa" w:w="2600"/>
+            <w:tcW w:type="dxa" w:w="2100"/>
             <w:tcMar>
               <w:top w:type="dxa" w:w="80"/>
               <w:left w:type="dxa" w:w="100"/>
@@ -5420,7 +5534,7 @@
         </w:tc>
         <w:tc>
           <w:tcPr>
-            <w:tcW w:type="dxa" w:w="5000"/>
+            <w:tcW w:type="dxa" w:w="2900"/>
             <w:tcMar>
               <w:top w:type="dxa" w:w="80"/>
               <w:left w:type="dxa" w:w="100"/>
@@ -5444,7 +5558,7 @@
         </w:tc>
         <w:tc>
           <w:tcPr>
-            <w:tcW w:type="dxa" w:w="1750"/>
+            <w:tcW w:type="dxa" w:w="500"/>
             <w:tcMar>
               <w:top w:type="dxa" w:w="80"/>
               <w:left w:type="dxa" w:w="100"/>
@@ -5463,6 +5577,30 @@
                 <w:szCs w:val="20"/>
               </w:rPr>
               <w:t xml:space="preserve">1</w:t>
+            </w:r>
+          </w:p>
+        </w:tc>
+        <w:tc>
+          <w:tcPr>
+            <w:tcW w:type="dxa" w:w="3850"/>
+            <w:tcMar>
+              <w:top w:type="dxa" w:w="80"/>
+              <w:left w:type="dxa" w:w="100"/>
+              <w:bottom w:type="dxa" w:w="80"/>
+              <w:right w:type="dxa" w:w="100"/>
+            </w:tcMar>
+            <w:vAlign w:val="center"/>
+          </w:tcPr>
+          <w:p>
+            <w:r>
+              <w:rPr>
+                <w:b w:val="false"/>
+                <w:bCs w:val="false"/>
+                <w:color w:val="000000"/>
+                <w:sz w:val="20"/>
+                <w:szCs w:val="20"/>
+              </w:rPr>
+              <w:t xml:space="preserve">Quản lý tiến độ sản phẩm tổng thể, kết nối trực tiếp với CEO</w:t>
             </w:r>
           </w:p>
         </w:tc>
@@ -5470,7 +5608,7 @@
       <w:tr>
         <w:tc>
           <w:tcPr>
-            <w:tcW w:type="dxa" w:w="2600"/>
+            <w:tcW w:type="dxa" w:w="2100"/>
             <w:shd w:fill="F2F2F2" w:val="clear"/>
             <w:tcMar>
               <w:top w:type="dxa" w:w="80"/>
@@ -5495,7 +5633,7 @@
         </w:tc>
         <w:tc>
           <w:tcPr>
-            <w:tcW w:type="dxa" w:w="5000"/>
+            <w:tcW w:type="dxa" w:w="2900"/>
             <w:shd w:fill="F2F2F2" w:val="clear"/>
             <w:tcMar>
               <w:top w:type="dxa" w:w="80"/>
@@ -5520,7 +5658,7 @@
         </w:tc>
         <w:tc>
           <w:tcPr>
-            <w:tcW w:type="dxa" w:w="1750"/>
+            <w:tcW w:type="dxa" w:w="500"/>
             <w:shd w:fill="F2F2F2" w:val="clear"/>
             <w:tcMar>
               <w:top w:type="dxa" w:w="80"/>
@@ -5540,6 +5678,31 @@
                 <w:szCs w:val="20"/>
               </w:rPr>
               <w:t xml:space="preserve">2</w:t>
+            </w:r>
+          </w:p>
+        </w:tc>
+        <w:tc>
+          <w:tcPr>
+            <w:tcW w:type="dxa" w:w="3850"/>
+            <w:shd w:fill="F2F2F2" w:val="clear"/>
+            <w:tcMar>
+              <w:top w:type="dxa" w:w="80"/>
+              <w:left w:type="dxa" w:w="100"/>
+              <w:bottom w:type="dxa" w:w="80"/>
+              <w:right w:type="dxa" w:w="100"/>
+            </w:tcMar>
+            <w:vAlign w:val="center"/>
+          </w:tcPr>
+          <w:p>
+            <w:r>
+              <w:rPr>
+                <w:b w:val="false"/>
+                <w:bCs w:val="false"/>
+                <w:color w:val="000000"/>
+                <w:sz w:val="20"/>
+                <w:szCs w:val="20"/>
+              </w:rPr>
+              <w:t xml:space="preserve">Thiết kế toàn bộ giao diện Web, App, Dashboard Admin</w:t>
             </w:r>
           </w:p>
         </w:tc>
@@ -5547,7 +5710,7 @@
       <w:tr>
         <w:tc>
           <w:tcPr>
-            <w:tcW w:type="dxa" w:w="2600"/>
+            <w:tcW w:type="dxa" w:w="2100"/>
             <w:tcMar>
               <w:top w:type="dxa" w:w="80"/>
               <w:left w:type="dxa" w:w="100"/>
@@ -5571,7 +5734,7 @@
         </w:tc>
         <w:tc>
           <w:tcPr>
-            <w:tcW w:type="dxa" w:w="5000"/>
+            <w:tcW w:type="dxa" w:w="2900"/>
             <w:tcMar>
               <w:top w:type="dxa" w:w="80"/>
               <w:left w:type="dxa" w:w="100"/>
@@ -5595,7 +5758,7 @@
         </w:tc>
         <w:tc>
           <w:tcPr>
-            <w:tcW w:type="dxa" w:w="1750"/>
+            <w:tcW w:type="dxa" w:w="500"/>
             <w:tcMar>
               <w:top w:type="dxa" w:w="80"/>
               <w:left w:type="dxa" w:w="100"/>
@@ -5614,6 +5777,30 @@
                 <w:szCs w:val="20"/>
               </w:rPr>
               <w:t xml:space="preserve">2</w:t>
+            </w:r>
+          </w:p>
+        </w:tc>
+        <w:tc>
+          <w:tcPr>
+            <w:tcW w:type="dxa" w:w="3850"/>
+            <w:tcMar>
+              <w:top w:type="dxa" w:w="80"/>
+              <w:left w:type="dxa" w:w="100"/>
+              <w:bottom w:type="dxa" w:w="80"/>
+              <w:right w:type="dxa" w:w="100"/>
+            </w:tcMar>
+            <w:vAlign w:val="center"/>
+          </w:tcPr>
+          <w:p>
+            <w:r>
+              <w:rPr>
+                <w:b w:val="false"/>
+                <w:bCs w:val="false"/>
+                <w:color w:val="000000"/>
+                <w:sz w:val="20"/>
+                <w:szCs w:val="20"/>
+              </w:rPr>
+              <w:t xml:space="preserve">Lập trình logic hệ thống, bảo mật dữ liệu dòng tiền</w:t>
             </w:r>
           </w:p>
         </w:tc>
@@ -5621,7 +5808,7 @@
       <w:tr>
         <w:tc>
           <w:tcPr>
-            <w:tcW w:type="dxa" w:w="2600"/>
+            <w:tcW w:type="dxa" w:w="2100"/>
             <w:shd w:fill="F2F2F2" w:val="clear"/>
             <w:tcMar>
               <w:top w:type="dxa" w:w="80"/>
@@ -5646,7 +5833,7 @@
         </w:tc>
         <w:tc>
           <w:tcPr>
-            <w:tcW w:type="dxa" w:w="5000"/>
+            <w:tcW w:type="dxa" w:w="2900"/>
             <w:shd w:fill="F2F2F2" w:val="clear"/>
             <w:tcMar>
               <w:top w:type="dxa" w:w="80"/>
@@ -5671,7 +5858,7 @@
         </w:tc>
         <w:tc>
           <w:tcPr>
-            <w:tcW w:type="dxa" w:w="1750"/>
+            <w:tcW w:type="dxa" w:w="500"/>
             <w:shd w:fill="F2F2F2" w:val="clear"/>
             <w:tcMar>
               <w:top w:type="dxa" w:w="80"/>
@@ -5691,6 +5878,31 @@
                 <w:szCs w:val="20"/>
               </w:rPr>
               <w:t xml:space="preserve">2</w:t>
+            </w:r>
+          </w:p>
+        </w:tc>
+        <w:tc>
+          <w:tcPr>
+            <w:tcW w:type="dxa" w:w="3850"/>
+            <w:shd w:fill="F2F2F2" w:val="clear"/>
+            <w:tcMar>
+              <w:top w:type="dxa" w:w="80"/>
+              <w:left w:type="dxa" w:w="100"/>
+              <w:bottom w:type="dxa" w:w="80"/>
+              <w:right w:type="dxa" w:w="100"/>
+            </w:tcMar>
+            <w:vAlign w:val="center"/>
+          </w:tcPr>
+          <w:p>
+            <w:r>
+              <w:rPr>
+                <w:b w:val="false"/>
+                <w:bCs w:val="false"/>
+                <w:color w:val="000000"/>
+                <w:sz w:val="20"/>
+                <w:szCs w:val="20"/>
+              </w:rPr>
+              <w:t xml:space="preserve">Lập trình Web bán hàng nội thất &amp; các Dashboard</w:t>
             </w:r>
           </w:p>
         </w:tc>
@@ -5698,7 +5910,7 @@
       <w:tr>
         <w:tc>
           <w:tcPr>
-            <w:tcW w:type="dxa" w:w="2600"/>
+            <w:tcW w:type="dxa" w:w="2100"/>
             <w:tcMar>
               <w:top w:type="dxa" w:w="80"/>
               <w:left w:type="dxa" w:w="100"/>
@@ -5722,7 +5934,7 @@
         </w:tc>
         <w:tc>
           <w:tcPr>
-            <w:tcW w:type="dxa" w:w="5000"/>
+            <w:tcW w:type="dxa" w:w="2900"/>
             <w:tcMar>
               <w:top w:type="dxa" w:w="80"/>
               <w:left w:type="dxa" w:w="100"/>
@@ -5746,7 +5958,7 @@
         </w:tc>
         <w:tc>
           <w:tcPr>
-            <w:tcW w:type="dxa" w:w="1750"/>
+            <w:tcW w:type="dxa" w:w="500"/>
             <w:tcMar>
               <w:top w:type="dxa" w:w="80"/>
               <w:left w:type="dxa" w:w="100"/>
@@ -5765,6 +5977,30 @@
                 <w:szCs w:val="20"/>
               </w:rPr>
               <w:t xml:space="preserve">2</w:t>
+            </w:r>
+          </w:p>
+        </w:tc>
+        <w:tc>
+          <w:tcPr>
+            <w:tcW w:type="dxa" w:w="3850"/>
+            <w:tcMar>
+              <w:top w:type="dxa" w:w="80"/>
+              <w:left w:type="dxa" w:w="100"/>
+              <w:bottom w:type="dxa" w:w="80"/>
+              <w:right w:type="dxa" w:w="100"/>
+            </w:tcMar>
+            <w:vAlign w:val="center"/>
+          </w:tcPr>
+          <w:p>
+            <w:r>
+              <w:rPr>
+                <w:b w:val="false"/>
+                <w:bCs w:val="false"/>
+                <w:color w:val="000000"/>
+                <w:sz w:val="20"/>
+                <w:szCs w:val="20"/>
+              </w:rPr>
+              <w:t xml:space="preserve">Lập trình App di động cho Thợ và Giám sát công trình</w:t>
             </w:r>
           </w:p>
         </w:tc>
@@ -5772,7 +6008,7 @@
       <w:tr>
         <w:tc>
           <w:tcPr>
-            <w:tcW w:type="dxa" w:w="2600"/>
+            <w:tcW w:type="dxa" w:w="2100"/>
             <w:shd w:fill="F2F2F2" w:val="clear"/>
             <w:tcMar>
               <w:top w:type="dxa" w:w="80"/>
@@ -5797,7 +6033,7 @@
         </w:tc>
         <w:tc>
           <w:tcPr>
-            <w:tcW w:type="dxa" w:w="5000"/>
+            <w:tcW w:type="dxa" w:w="2900"/>
             <w:shd w:fill="F2F2F2" w:val="clear"/>
             <w:tcMar>
               <w:top w:type="dxa" w:w="80"/>
@@ -5822,7 +6058,7 @@
         </w:tc>
         <w:tc>
           <w:tcPr>
-            <w:tcW w:type="dxa" w:w="1750"/>
+            <w:tcW w:type="dxa" w:w="500"/>
             <w:shd w:fill="F2F2F2" w:val="clear"/>
             <w:tcMar>
               <w:top w:type="dxa" w:w="80"/>
@@ -5842,6 +6078,31 @@
                 <w:szCs w:val="20"/>
               </w:rPr>
               <w:t xml:space="preserve">2</w:t>
+            </w:r>
+          </w:p>
+        </w:tc>
+        <w:tc>
+          <w:tcPr>
+            <w:tcW w:type="dxa" w:w="3850"/>
+            <w:shd w:fill="F2F2F2" w:val="clear"/>
+            <w:tcMar>
+              <w:top w:type="dxa" w:w="80"/>
+              <w:left w:type="dxa" w:w="100"/>
+              <w:bottom w:type="dxa" w:w="80"/>
+              <w:right w:type="dxa" w:w="100"/>
+            </w:tcMar>
+            <w:vAlign w:val="center"/>
+          </w:tcPr>
+          <w:p>
+            <w:r>
+              <w:rPr>
+                <w:b w:val="false"/>
+                <w:bCs w:val="false"/>
+                <w:color w:val="000000"/>
+                <w:sz w:val="20"/>
+                <w:szCs w:val="20"/>
+              </w:rPr>
+              <w:t xml:space="preserve">Huấn luyện mô hình AI sắp xếp và render đồ đạc</w:t>
             </w:r>
           </w:p>
         </w:tc>
@@ -5849,7 +6110,7 @@
       <w:tr>
         <w:tc>
           <w:tcPr>
-            <w:tcW w:type="dxa" w:w="2600"/>
+            <w:tcW w:type="dxa" w:w="2100"/>
             <w:tcMar>
               <w:top w:type="dxa" w:w="80"/>
               <w:left w:type="dxa" w:w="100"/>
@@ -5873,7 +6134,7 @@
         </w:tc>
         <w:tc>
           <w:tcPr>
-            <w:tcW w:type="dxa" w:w="5000"/>
+            <w:tcW w:type="dxa" w:w="2900"/>
             <w:tcMar>
               <w:top w:type="dxa" w:w="80"/>
               <w:left w:type="dxa" w:w="100"/>
@@ -5897,7 +6158,7 @@
         </w:tc>
         <w:tc>
           <w:tcPr>
-            <w:tcW w:type="dxa" w:w="1750"/>
+            <w:tcW w:type="dxa" w:w="500"/>
             <w:tcMar>
               <w:top w:type="dxa" w:w="80"/>
               <w:left w:type="dxa" w:w="100"/>
@@ -5916,6 +6177,30 @@
                 <w:szCs w:val="20"/>
               </w:rPr>
               <w:t xml:space="preserve">2</w:t>
+            </w:r>
+          </w:p>
+        </w:tc>
+        <w:tc>
+          <w:tcPr>
+            <w:tcW w:type="dxa" w:w="3850"/>
+            <w:tcMar>
+              <w:top w:type="dxa" w:w="80"/>
+              <w:left w:type="dxa" w:w="100"/>
+              <w:bottom w:type="dxa" w:w="80"/>
+              <w:right w:type="dxa" w:w="100"/>
+            </w:tcMar>
+            <w:vAlign w:val="center"/>
+          </w:tcPr>
+          <w:p>
+            <w:r>
+              <w:rPr>
+                <w:b w:val="false"/>
+                <w:bCs w:val="false"/>
+                <w:color w:val="000000"/>
+                <w:sz w:val="20"/>
+                <w:szCs w:val="20"/>
+              </w:rPr>
+              <w:t xml:space="preserve">Kiểm thử lỗi hệ thống, kiểm thử quét QR kho, kiểm thử định vị GPS</w:t>
             </w:r>
           </w:p>
         </w:tc>
@@ -5923,7 +6208,7 @@
       <w:tr>
         <w:tc>
           <w:tcPr>
-            <w:tcW w:type="dxa" w:w="2600"/>
+            <w:tcW w:type="dxa" w:w="2100"/>
             <w:shd w:fill="F2F2F2" w:val="clear"/>
             <w:tcMar>
               <w:top w:type="dxa" w:w="80"/>
@@ -5948,7 +6233,7 @@
         </w:tc>
         <w:tc>
           <w:tcPr>
-            <w:tcW w:type="dxa" w:w="5000"/>
+            <w:tcW w:type="dxa" w:w="2900"/>
             <w:shd w:fill="F2F2F2" w:val="clear"/>
             <w:tcMar>
               <w:top w:type="dxa" w:w="80"/>
@@ -5973,7 +6258,7 @@
         </w:tc>
         <w:tc>
           <w:tcPr>
-            <w:tcW w:type="dxa" w:w="1750"/>
+            <w:tcW w:type="dxa" w:w="500"/>
             <w:shd w:fill="F2F2F2" w:val="clear"/>
             <w:tcMar>
               <w:top w:type="dxa" w:w="80"/>
@@ -5993,11 +6278,56 @@
                 <w:szCs w:val="20"/>
               </w:rPr>
               <w:t xml:space="preserve">1</w:t>
+            </w:r>
+          </w:p>
+        </w:tc>
+        <w:tc>
+          <w:tcPr>
+            <w:tcW w:type="dxa" w:w="3850"/>
+            <w:shd w:fill="F2F2F2" w:val="clear"/>
+            <w:tcMar>
+              <w:top w:type="dxa" w:w="80"/>
+              <w:left w:type="dxa" w:w="100"/>
+              <w:bottom w:type="dxa" w:w="80"/>
+              <w:right w:type="dxa" w:w="100"/>
+            </w:tcMar>
+            <w:vAlign w:val="center"/>
+          </w:tcPr>
+          <w:p>
+            <w:r>
+              <w:rPr>
+                <w:b w:val="false"/>
+                <w:bCs w:val="false"/>
+                <w:color w:val="000000"/>
+                <w:sz w:val="20"/>
+                <w:szCs w:val="20"/>
+              </w:rPr>
+              <w:t xml:space="preserve">Kỹ sư trưởng kiến trúc hệ thống, cấu hình hạ tầng Cloud AWS/Supabase</w:t>
             </w:r>
           </w:p>
         </w:tc>
       </w:tr>
     </w:tbl>
+    <w:p>
+      <w:pPr>
+        <w:pBdr>
+          <w:left w:val="single" w:color="B8860B" w:sz="18" w:space="8"/>
+        </w:pBdr>
+        <w:shd w:fill="F2F2F2" w:val="clear"/>
+        <w:spacing w:after="100" w:before="200" w:line="300"/>
+        <w:ind w:left="200"/>
+      </w:pPr>
+      <w:r>
+        <w:rPr>
+          <w:i/>
+          <w:iCs/>
+          <w:color w:val="1F3864"/>
+          <w:sz w:val="20"/>
+          <w:szCs w:val="20"/>
+        </w:rPr>
+        <w:t xml:space="preserve">Ghi chú: Bảng định biên trên thể hiện QUY MÔ nhân sự cần thiết (số lượng, vai trò, nhiệm vụ). Mức thù lao/chi phí thuê khoán cho từng vị trí sẽ được trình trong Phụ lục Ngân sách sau khi cơ cấu nhân sự này được HĐQT/Cổ đông thông qua.</w:t>
+      </w:r>
+    </w:p>
     <w:p>
       <w:pPr>
         <w:pStyle w:val="Heading1"/>
@@ -6292,7 +6622,7 @@
                 <w:sz w:val="20"/>
                 <w:szCs w:val="20"/>
               </w:rPr>
-              <w:t xml:space="preserve">Giải ngân 4 đợt (20/30/30/20%) gắn chặt với mốc nghiệm thu kỹ thuật thực tế; bàn giao Master account &amp; source code sạch ở đợt cuối</w:t>
+              <w:t xml:space="preserve">Chia 4 cổng nghiệm thu kỹ thuật độc lập (mục 8.1); bàn giao Master account &amp; source code sạch chỉ ở cổng cuối cùng</w:t>
             </w:r>
           </w:p>
         </w:tc>
@@ -6982,7 +7312,7 @@
           <w:sz w:val="22"/>
           <w:szCs w:val="22"/>
         </w:rPr>
-        <w:t xml:space="preserve">Kính trình HĐQT/Cổ đông Qi Holding xem xét và phê duyệt các nội dung sau:</w:t>
+        <w:t xml:space="preserve">Kính trình HĐQT/Cổ đông Qi Holding xem xét và phê duyệt các nội dung sau (chưa bao gồm ngân sách chi tiết):</w:t>
       </w:r>
     </w:p>
     <w:p>
@@ -6999,7 +7329,7 @@
           <w:sz w:val="22"/>
           <w:szCs w:val="22"/>
         </w:rPr>
-        <w:t xml:space="preserve">Phê duyệt chủ trương đầu tư ngân sách công nghệ theo phương án tối ưu chi phí: 200 triệu VNĐ nhân sự (2 tháng) + 100 triệu VNĐ hạ tầng setup + chi phí vận hành định kỳ (Supabase, API AI, lưu trữ đám mây).</w:t>
+        <w:t xml:space="preserve">Phê duyệt phạm vi hạng mục đầu tư về nhân sự, hạ tầng công nghệ và công cụ vận hành như trình bày tại Mục 9 — làm cơ sở để đội dự án tiến hành báo giá và trình Phụ lục Ngân sách chi tiết ở vòng sau.</w:t>
       </w:r>
     </w:p>
     <w:p>
@@ -7016,7 +7346,7 @@
           <w:sz w:val="22"/>
           <w:szCs w:val="22"/>
         </w:rPr>
-        <w:t xml:space="preserve">Phê duyệt cơ chế giải ngân 4 đợt (20/30/30/20%) cho đội Tech gắn với mốc nghiệm thu kỹ thuật, nhằm bảo vệ dòng vốn của công ty.</w:t>
+        <w:t xml:space="preserve">Phê duyệt cơ chế nghiệm thu kỹ thuật theo 4 cổng (Mục 8.1) làm khung kiểm soát chất lượng và tiến độ cho đội Tech, trước khi gắn điều khoản thanh toán cụ thể.</w:t>
       </w:r>
     </w:p>
     <w:p>
@@ -7051,6 +7381,23 @@
           <w:szCs w:val="22"/>
         </w:rPr>
         <w:t xml:space="preserve">Ủy quyền cho CEO (Nguyễn Duy Quang) trực tiếp đàm phán và ký kết Master Agreement với Vingroup và ngân hàng đối tác trong khung chính sách đã trình bày tại đề án này.</w:t>
+      </w:r>
+    </w:p>
+    <w:p>
+      <w:pPr>
+        <w:pStyle w:val="ListParagraph"/>
+        <w:numPr>
+          <w:ilvl w:val="0"/>
+          <w:numId w:val="2"/>
+        </w:numPr>
+        <w:spacing w:after="100" w:line="280"/>
+      </w:pPr>
+      <w:r>
+        <w:rPr>
+          <w:sz w:val="22"/>
+          <w:szCs w:val="22"/>
+        </w:rPr>
+        <w:t xml:space="preserve">Sau khi phạm vi tại đề án này được thông qua, đội dự án sẽ trình bổ sung Phụ lục Ngân sách chi tiết (chi phí nhân sự, hạ tầng, vận hành định kỳ) để HĐQT/Cổ đông phê duyệt ở phiên họp tiếp theo.</w:t>
       </w:r>
     </w:p>
     <w:p>

</xml_diff>